<commit_message>
Park slide 2 bridge line for fresh eyes
Co-Authored-By: Claude Opus 4.6 <noreply@anthropic.com>
</commit_message>
<xml_diff>
--- a/TalkTrack.docx
+++ b/TalkTrack.docx
@@ -133,7 +133,27 @@
         <w:pStyle w:val="BodyText"/>
       </w:pPr>
       <w:r>
-        <w:t xml:space="preserve">She hate-swipes. He ego-swipes. Neither they nor the business wins. The swipe became the dopamine hit. The date was always the point. It just never materialised.</w:t>
+        <w:t xml:space="preserve">She hate-swipes. He ego-swipes. Neither they nor the business wins.</w:t>
+      </w:r>
+    </w:p>
+    <w:p>
+      <w:pPr>
+        <w:pStyle w:val="BodyText"/>
+      </w:pPr>
+      <w:r>
+        <w:t xml:space="preserve">[REVISIT — bridge line from closer to</w:t>
+      </w:r>
+      <w:r>
+        <w:t xml:space="preserve"> </w:t>
+      </w:r>
+      <w:r>
+        <w:t xml:space="preserve">“That’s the gap we’re walking into.”</w:t>
+      </w:r>
+      <w:r>
+        <w:t xml:space="preserve"> </w:t>
+      </w:r>
+      <w:r>
+        <w:t xml:space="preserve">Parked for fresh eyes.]</w:t>
       </w:r>
     </w:p>
     <w:p>

</xml_diff>